<commit_message>
update for AI-IoT in Seattle
</commit_message>
<xml_diff>
--- a/Systems-requirements.docx
+++ b/Systems-requirements.docx
@@ -8,6 +8,9 @@
       </w:pPr>
       <w:r>
         <w:t>System</w:t>
+      </w:r>
+      <w:r>
+        <w:t>/account</w:t>
       </w:r>
       <w:r>
         <w:t xml:space="preserve"> requirements</w:t>
@@ -23,19 +26,22 @@
         <w:t>202</w:t>
       </w:r>
       <w:r>
-        <w:t>5</w:t>
+        <w:t>6</w:t>
       </w:r>
       <w:r>
         <w:t>-</w:t>
       </w:r>
       <w:r>
-        <w:t>10</w:t>
+        <w:t>05</w:t>
       </w:r>
       <w:r>
         <w:t>-</w:t>
       </w:r>
       <w:r>
-        <w:t>24</w:t>
+        <w:t>2</w:t>
+      </w:r>
+      <w:r>
+        <w:t>0</w:t>
       </w:r>
     </w:p>
     <w:p/>
@@ -85,7 +91,6 @@
           <w14:ligatures w14:val="none"/>
         </w:rPr>
       </w:pPr>
-      <w:proofErr w:type="gramStart"/>
       <w:r>
         <w:rPr>
           <w:rFonts w:asciiTheme="majorHAnsi" w:eastAsia="Times New Roman" w:hAnsiTheme="majorHAnsi" w:cs="Courier New"/>
@@ -106,9 +111,52 @@
           <w:szCs w:val="36"/>
           <w14:ligatures w14:val="none"/>
         </w:rPr>
-        <w:t xml:space="preserve"> (</w:t>
+        <w:t xml:space="preserve"> </w:t>
       </w:r>
-      <w:proofErr w:type="gramEnd"/>
+      <w:r>
+        <w:rPr>
+          <w:rFonts w:asciiTheme="majorHAnsi" w:eastAsia="Times New Roman" w:hAnsiTheme="majorHAnsi" w:cs="Courier New"/>
+          <w:color w:val="0070C0"/>
+          <w:kern w:val="0"/>
+          <w:sz w:val="36"/>
+          <w:szCs w:val="36"/>
+          <w14:ligatures w14:val="none"/>
+        </w:rPr>
+        <w:t>account</w:t>
+      </w:r>
+      <w:r>
+        <w:rPr>
+          <w:rFonts w:asciiTheme="majorHAnsi" w:eastAsia="Times New Roman" w:hAnsiTheme="majorHAnsi" w:cs="Courier New"/>
+          <w:color w:val="0070C0"/>
+          <w:kern w:val="0"/>
+          <w:sz w:val="36"/>
+          <w:szCs w:val="36"/>
+          <w14:ligatures w14:val="none"/>
+        </w:rPr>
+        <w:t xml:space="preserve"> ( </w:t>
+      </w:r>
+      <w:r>
+        <w:rPr>
+          <w:rFonts w:asciiTheme="majorHAnsi" w:eastAsia="Times New Roman" w:hAnsiTheme="majorHAnsi" w:cs="Courier New"/>
+          <w:color w:val="0070C0"/>
+          <w:kern w:val="0"/>
+          <w:sz w:val="36"/>
+          <w:szCs w:val="36"/>
+          <w14:ligatures w14:val="none"/>
+        </w:rPr>
+        <w:t>gitpages</w:t>
+      </w:r>
+      <w:r>
+        <w:rPr>
+          <w:rFonts w:asciiTheme="majorHAnsi" w:eastAsia="Times New Roman" w:hAnsiTheme="majorHAnsi" w:cs="Courier New"/>
+          <w:color w:val="0070C0"/>
+          <w:kern w:val="0"/>
+          <w:sz w:val="36"/>
+          <w:szCs w:val="36"/>
+          <w14:ligatures w14:val="none"/>
+        </w:rPr>
+        <w:t xml:space="preserve"> )</w:t>
+      </w:r>
       <w:r>
         <w:rPr>
           <w:rFonts w:asciiTheme="majorHAnsi" w:eastAsia="Times New Roman" w:hAnsiTheme="majorHAnsi" w:cs="Courier New"/>
@@ -120,32 +168,6 @@
         </w:rPr>
         <w:t xml:space="preserve"> </w:t>
       </w:r>
-      <w:proofErr w:type="spellStart"/>
-      <w:proofErr w:type="gramStart"/>
-      <w:r>
-        <w:rPr>
-          <w:rFonts w:asciiTheme="majorHAnsi" w:eastAsia="Times New Roman" w:hAnsiTheme="majorHAnsi" w:cs="Courier New"/>
-          <w:color w:val="0070C0"/>
-          <w:kern w:val="0"/>
-          <w:sz w:val="36"/>
-          <w:szCs w:val="36"/>
-          <w14:ligatures w14:val="none"/>
-        </w:rPr>
-        <w:t>gitpages</w:t>
-      </w:r>
-      <w:proofErr w:type="spellEnd"/>
-      <w:r>
-        <w:rPr>
-          <w:rFonts w:asciiTheme="majorHAnsi" w:eastAsia="Times New Roman" w:hAnsiTheme="majorHAnsi" w:cs="Courier New"/>
-          <w:color w:val="0070C0"/>
-          <w:kern w:val="0"/>
-          <w:sz w:val="36"/>
-          <w:szCs w:val="36"/>
-          <w14:ligatures w14:val="none"/>
-        </w:rPr>
-        <w:t xml:space="preserve"> )</w:t>
-      </w:r>
-      <w:proofErr w:type="gramEnd"/>
     </w:p>
     <w:p>
       <w:pPr>
@@ -1489,23 +1511,6 @@
 </file>
 
 <file path=customXml/item1.xml><?xml version="1.0" encoding="utf-8"?>
-<p:properties xmlns:p="http://schemas.microsoft.com/office/2006/metadata/properties" xmlns:xsi="http://www.w3.org/2001/XMLSchema-instance" xmlns:pc="http://schemas.microsoft.com/office/infopath/2007/PartnerControls">
-  <documentManagement>
-    <_activity xmlns="4fe3d20b-a07a-4c9a-bffb-7d845be05fd8" xsi:nil="true"/>
-  </documentManagement>
-</p:properties>
-</file>
-
-<file path=customXml/item2.xml><?xml version="1.0" encoding="utf-8"?>
-<?mso-contentType ?>
-<FormTemplates xmlns="http://schemas.microsoft.com/sharepoint/v3/contenttype/forms">
-  <Display>DocumentLibraryForm</Display>
-  <Edit>DocumentLibraryForm</Edit>
-  <New>DocumentLibraryForm</New>
-</FormTemplates>
-</file>
-
-<file path=customXml/item3.xml><?xml version="1.0" encoding="utf-8"?>
 <ct:contentTypeSchema xmlns:ct="http://schemas.microsoft.com/office/2006/metadata/contentType" xmlns:ma="http://schemas.microsoft.com/office/2006/metadata/properties/metaAttributes" ct:_="" ma:_="" ma:contentTypeName="Document" ma:contentTypeID="0x01010081536BDC192B6C4F81C96BF422C1FE42" ma:contentTypeVersion="18" ma:contentTypeDescription="Create a new document." ma:contentTypeScope="" ma:versionID="d46938d6f6bd866d105c4949cb5fb9b5">
   <xsd:schema xmlns:xsd="http://www.w3.org/2001/XMLSchema" xmlns:xs="http://www.w3.org/2001/XMLSchema" xmlns:p="http://schemas.microsoft.com/office/2006/metadata/properties" xmlns:ns3="d29cdd0d-72e7-4351-868a-19765b075a7c" xmlns:ns4="4fe3d20b-a07a-4c9a-bffb-7d845be05fd8" targetNamespace="http://schemas.microsoft.com/office/2006/metadata/properties" ma:root="true" ma:fieldsID="4d6af76238615b7197f65e891d9f03f9" ns3:_="" ns4:_="">
     <xsd:import namespace="d29cdd0d-72e7-4351-868a-19765b075a7c"/>
@@ -1758,25 +1763,24 @@
 </ct:contentTypeSchema>
 </file>
 
-<file path=customXml/itemProps1.xml><?xml version="1.0" encoding="utf-8"?>
-<ds:datastoreItem xmlns:ds="http://schemas.openxmlformats.org/officeDocument/2006/customXml" ds:itemID="{770383F4-297F-4ECD-A188-9792185434D0}">
-  <ds:schemaRefs>
-    <ds:schemaRef ds:uri="http://schemas.microsoft.com/office/2006/metadata/properties"/>
-    <ds:schemaRef ds:uri="http://schemas.microsoft.com/office/infopath/2007/PartnerControls"/>
-    <ds:schemaRef ds:uri="4fe3d20b-a07a-4c9a-bffb-7d845be05fd8"/>
-  </ds:schemaRefs>
-</ds:datastoreItem>
+<file path=customXml/item2.xml><?xml version="1.0" encoding="utf-8"?>
+<?mso-contentType ?>
+<FormTemplates xmlns="http://schemas.microsoft.com/sharepoint/v3/contenttype/forms">
+  <Display>DocumentLibraryForm</Display>
+  <Edit>DocumentLibraryForm</Edit>
+  <New>DocumentLibraryForm</New>
+</FormTemplates>
 </file>
 
-<file path=customXml/itemProps2.xml><?xml version="1.0" encoding="utf-8"?>
-<ds:datastoreItem xmlns:ds="http://schemas.openxmlformats.org/officeDocument/2006/customXml" ds:itemID="{17E3985A-85F1-4D43-A337-95DA9D0FE839}">
-  <ds:schemaRefs>
-    <ds:schemaRef ds:uri="http://schemas.microsoft.com/sharepoint/v3/contenttype/forms"/>
-  </ds:schemaRefs>
-</ds:datastoreItem>
+<file path=customXml/item3.xml><?xml version="1.0" encoding="utf-8"?>
+<p:properties xmlns:p="http://schemas.microsoft.com/office/2006/metadata/properties" xmlns:xsi="http://www.w3.org/2001/XMLSchema-instance" xmlns:pc="http://schemas.microsoft.com/office/infopath/2007/PartnerControls">
+  <documentManagement>
+    <_activity xmlns="4fe3d20b-a07a-4c9a-bffb-7d845be05fd8" xsi:nil="true"/>
+  </documentManagement>
+</p:properties>
 </file>
 
-<file path=customXml/itemProps3.xml><?xml version="1.0" encoding="utf-8"?>
+<file path=customXml/itemProps1.xml><?xml version="1.0" encoding="utf-8"?>
 <ds:datastoreItem xmlns:ds="http://schemas.openxmlformats.org/officeDocument/2006/customXml" ds:itemID="{429528DC-CDA2-4959-A74F-A62864B63151}">
   <ds:schemaRefs>
     <ds:schemaRef ds:uri="http://schemas.microsoft.com/office/2006/metadata/contentType"/>
@@ -1793,4 +1797,22 @@
     <ds:schemaRef ds:uri="http://schemas.microsoft.com/internal/obd"/>
   </ds:schemaRefs>
 </ds:datastoreItem>
+</file>
+
+<file path=customXml/itemProps2.xml><?xml version="1.0" encoding="utf-8"?>
+<ds:datastoreItem xmlns:ds="http://schemas.openxmlformats.org/officeDocument/2006/customXml" ds:itemID="{17E3985A-85F1-4D43-A337-95DA9D0FE839}">
+  <ds:schemaRefs>
+    <ds:schemaRef ds:uri="http://schemas.microsoft.com/sharepoint/v3/contenttype/forms"/>
+  </ds:schemaRefs>
+</ds:datastoreItem>
+</file>
+
+<file path=customXml/itemProps3.xml><?xml version="1.0" encoding="utf-8"?>
+<ds:datastoreItem xmlns:ds="http://schemas.openxmlformats.org/officeDocument/2006/customXml" ds:itemID="{770383F4-297F-4ECD-A188-9792185434D0}">
+  <ds:schemaRefs>
+    <ds:schemaRef ds:uri="http://schemas.microsoft.com/office/2006/metadata/properties"/>
+    <ds:schemaRef ds:uri="http://schemas.microsoft.com/office/infopath/2007/PartnerControls"/>
+    <ds:schemaRef ds:uri="4fe3d20b-a07a-4c9a-bffb-7d845be05fd8"/>
+  </ds:schemaRefs>
+</ds:datastoreItem>
 </file>
</xml_diff>